<commit_message>
complete 3 tsk for lab2
</commit_message>
<xml_diff>
--- a/Лабораторная работа 2.docx
+++ b/Лабораторная работа 2.docx
@@ -947,15 +947,7 @@
                 <w:sz w:val="28"/>
                 <w:szCs w:val="28"/>
               </w:rPr>
-              <w:t>а=</w:t>
-            </w:r>
-            <w:r>
-              <w:rPr>
-                <w:rFonts w:ascii="Times New Roman" w:hAnsi="Times New Roman" w:cs="Times New Roman"/>
-                <w:sz w:val="28"/>
-                <w:szCs w:val="28"/>
-              </w:rPr>
-              <w:t>2</w:t>
+              <w:t>а=2</w:t>
             </w:r>
             <w:r>
               <w:rPr>
@@ -1167,23 +1159,7 @@
                 <w:sz w:val="28"/>
                 <w:szCs w:val="28"/>
               </w:rPr>
-              <w:t>а=</w:t>
-            </w:r>
-            <w:r>
-              <w:rPr>
-                <w:rFonts w:ascii="Times New Roman" w:hAnsi="Times New Roman" w:cs="Times New Roman"/>
-                <w:sz w:val="28"/>
-                <w:szCs w:val="28"/>
-              </w:rPr>
-              <w:t>0</w:t>
-            </w:r>
-            <w:r>
-              <w:rPr>
-                <w:rFonts w:ascii="Times New Roman" w:hAnsi="Times New Roman" w:cs="Times New Roman"/>
-                <w:sz w:val="28"/>
-                <w:szCs w:val="28"/>
-              </w:rPr>
-              <w:t xml:space="preserve">, </w:t>
+              <w:t xml:space="preserve">а=0, </w:t>
             </w:r>
             <w:r>
               <w:rPr>
@@ -1272,23 +1248,7 @@
                 <w:sz w:val="28"/>
                 <w:szCs w:val="28"/>
               </w:rPr>
-              <w:t>а=</w:t>
-            </w:r>
-            <w:r>
-              <w:rPr>
-                <w:rFonts w:ascii="Times New Roman" w:hAnsi="Times New Roman" w:cs="Times New Roman"/>
-                <w:sz w:val="28"/>
-                <w:szCs w:val="28"/>
-              </w:rPr>
-              <w:t>2</w:t>
-            </w:r>
-            <w:r>
-              <w:rPr>
-                <w:rFonts w:ascii="Times New Roman" w:hAnsi="Times New Roman" w:cs="Times New Roman"/>
-                <w:sz w:val="28"/>
-                <w:szCs w:val="28"/>
-              </w:rPr>
-              <w:t xml:space="preserve">, </w:t>
+              <w:t xml:space="preserve">а=2, </w:t>
             </w:r>
             <w:r>
               <w:rPr>
@@ -1411,15 +1371,7 @@
                 <w:sz w:val="28"/>
                 <w:szCs w:val="28"/>
               </w:rPr>
-              <w:t>3</w:t>
-            </w:r>
-            <w:r>
-              <w:rPr>
-                <w:rFonts w:ascii="Times New Roman" w:hAnsi="Times New Roman" w:cs="Times New Roman"/>
-                <w:sz w:val="28"/>
-                <w:szCs w:val="28"/>
-              </w:rPr>
-              <w:t xml:space="preserve">, </w:t>
+              <w:t xml:space="preserve">3, </w:t>
             </w:r>
             <w:r>
               <w:rPr>
@@ -1797,52 +1749,7 @@
                 <w:szCs w:val="28"/>
                 <w:lang w:val="en-US"/>
               </w:rPr>
-              <w:t>pass = Q</w:t>
-            </w:r>
-            <w:r>
-              <w:rPr>
-                <w:rFonts w:ascii="Times New Roman" w:hAnsi="Times New Roman" w:cs="Times New Roman"/>
-                <w:sz w:val="28"/>
-                <w:szCs w:val="28"/>
-                <w:lang w:val="en-US"/>
-              </w:rPr>
-              <w:t>,</w:t>
-            </w:r>
-            <w:r>
-              <w:rPr>
-                <w:rFonts w:ascii="Times New Roman" w:hAnsi="Times New Roman" w:cs="Times New Roman"/>
-                <w:sz w:val="28"/>
-                <w:szCs w:val="28"/>
-                <w:lang w:val="en-US"/>
-              </w:rPr>
-              <w:t>W</w:t>
-            </w:r>
-            <w:r>
-              <w:rPr>
-                <w:rFonts w:ascii="Times New Roman" w:hAnsi="Times New Roman" w:cs="Times New Roman"/>
-                <w:sz w:val="28"/>
-                <w:szCs w:val="28"/>
-                <w:lang w:val="en-US"/>
-              </w:rPr>
-              <w:t>=E</w:t>
-            </w:r>
-            <w:r>
-              <w:rPr>
-                <w:rFonts w:ascii="Times New Roman" w:hAnsi="Times New Roman" w:cs="Times New Roman"/>
-                <w:sz w:val="28"/>
-                <w:szCs w:val="28"/>
-                <w:lang w:val="en-US"/>
-              </w:rPr>
-              <w:t>RTY</w:t>
-            </w:r>
-            <w:r>
-              <w:rPr>
-                <w:rFonts w:ascii="Times New Roman" w:hAnsi="Times New Roman" w:cs="Times New Roman"/>
-                <w:sz w:val="28"/>
-                <w:szCs w:val="28"/>
-                <w:lang w:val="en-US"/>
-              </w:rPr>
-              <w:t>123</w:t>
+              <w:t>pass = Q,W=ERTY123</w:t>
             </w:r>
           </w:p>
         </w:tc>
@@ -1925,25 +1832,7 @@
                 <w:szCs w:val="28"/>
                 <w:lang w:val="en-US"/>
               </w:rPr>
-              <w:t>q</w:t>
-            </w:r>
-            <w:r>
-              <w:rPr>
-                <w:rFonts w:ascii="Times New Roman" w:hAnsi="Times New Roman" w:cs="Times New Roman"/>
-                <w:sz w:val="28"/>
-                <w:szCs w:val="28"/>
-                <w:lang w:val="en-US"/>
-              </w:rPr>
-              <w:t>,</w:t>
-            </w:r>
-            <w:r>
-              <w:rPr>
-                <w:rFonts w:ascii="Times New Roman" w:hAnsi="Times New Roman" w:cs="Times New Roman"/>
-                <w:sz w:val="28"/>
-                <w:szCs w:val="28"/>
-                <w:lang w:val="en-US"/>
-              </w:rPr>
-              <w:t>w</w:t>
+              <w:t>q,w</w:t>
             </w:r>
             <w:proofErr w:type="spellEnd"/>
             <w:r>
@@ -1953,25 +1842,7 @@
                 <w:szCs w:val="28"/>
                 <w:lang w:val="en-US"/>
               </w:rPr>
-              <w:t>=</w:t>
-            </w:r>
-            <w:r>
-              <w:rPr>
-                <w:rFonts w:ascii="Times New Roman" w:hAnsi="Times New Roman" w:cs="Times New Roman"/>
-                <w:sz w:val="28"/>
-                <w:szCs w:val="28"/>
-                <w:lang w:val="en-US"/>
-              </w:rPr>
-              <w:t>erty</w:t>
-            </w:r>
-            <w:r>
-              <w:rPr>
-                <w:rFonts w:ascii="Times New Roman" w:hAnsi="Times New Roman" w:cs="Times New Roman"/>
-                <w:sz w:val="28"/>
-                <w:szCs w:val="28"/>
-                <w:lang w:val="en-US"/>
-              </w:rPr>
-              <w:t>123</w:t>
+              <w:t>=erty123</w:t>
             </w:r>
           </w:p>
         </w:tc>
@@ -2126,25 +1997,7 @@
                 <w:szCs w:val="28"/>
                 <w:lang w:val="en-US"/>
               </w:rPr>
-              <w:t>q,wE</w:t>
-            </w:r>
-            <w:r>
-              <w:rPr>
-                <w:rFonts w:ascii="Times New Roman" w:hAnsi="Times New Roman" w:cs="Times New Roman"/>
-                <w:sz w:val="28"/>
-                <w:szCs w:val="28"/>
-                <w:lang w:val="en-US"/>
-              </w:rPr>
-              <w:t>y</w:t>
-            </w:r>
-            <w:r>
-              <w:rPr>
-                <w:rFonts w:ascii="Times New Roman" w:hAnsi="Times New Roman" w:cs="Times New Roman"/>
-                <w:sz w:val="28"/>
-                <w:szCs w:val="28"/>
-                <w:lang w:val="en-US"/>
-              </w:rPr>
-              <w:t>3</w:t>
+              <w:t>q,wEy3</w:t>
             </w:r>
           </w:p>
         </w:tc>
@@ -2438,39 +2291,60 @@
                 <w:rFonts w:ascii="Times New Roman" w:hAnsi="Times New Roman" w:cs="Times New Roman"/>
                 <w:sz w:val="28"/>
                 <w:szCs w:val="28"/>
-                <w:lang w:val="en-US"/>
-              </w:rPr>
-            </w:pPr>
-            <w:bookmarkStart w:id="0" w:name="_GoBack"/>
-            <w:bookmarkEnd w:id="0"/>
-          </w:p>
-        </w:tc>
-        <w:tc>
-          <w:tcPr>
-            <w:tcW w:w="3115" w:type="dxa"/>
-          </w:tcPr>
-          <w:p>
-            <w:pPr>
-              <w:rPr>
-                <w:rFonts w:ascii="Times New Roman" w:hAnsi="Times New Roman" w:cs="Times New Roman"/>
-                <w:sz w:val="28"/>
-                <w:szCs w:val="28"/>
-              </w:rPr>
-            </w:pPr>
-          </w:p>
-        </w:tc>
-        <w:tc>
-          <w:tcPr>
-            <w:tcW w:w="3115" w:type="dxa"/>
-          </w:tcPr>
-          <w:p>
-            <w:pPr>
-              <w:rPr>
-                <w:rFonts w:ascii="Times New Roman" w:hAnsi="Times New Roman" w:cs="Times New Roman"/>
-                <w:sz w:val="28"/>
-                <w:szCs w:val="28"/>
-              </w:rPr>
-            </w:pPr>
+              </w:rPr>
+            </w:pPr>
+            <w:r>
+              <w:rPr>
+                <w:rFonts w:ascii="Times New Roman" w:hAnsi="Times New Roman" w:cs="Times New Roman"/>
+                <w:sz w:val="28"/>
+                <w:szCs w:val="28"/>
+              </w:rPr>
+              <w:t>Регистрация без заполнения полей</w:t>
+            </w:r>
+          </w:p>
+        </w:tc>
+        <w:tc>
+          <w:tcPr>
+            <w:tcW w:w="3115" w:type="dxa"/>
+          </w:tcPr>
+          <w:p>
+            <w:pPr>
+              <w:rPr>
+                <w:rFonts w:ascii="Times New Roman" w:hAnsi="Times New Roman" w:cs="Times New Roman"/>
+                <w:sz w:val="28"/>
+                <w:szCs w:val="28"/>
+              </w:rPr>
+            </w:pPr>
+            <w:r>
+              <w:rPr>
+                <w:rFonts w:ascii="Times New Roman" w:hAnsi="Times New Roman" w:cs="Times New Roman"/>
+                <w:sz w:val="28"/>
+                <w:szCs w:val="28"/>
+              </w:rPr>
+              <w:t>Вывод ошибки о незаполненных полях</w:t>
+            </w:r>
+          </w:p>
+        </w:tc>
+        <w:tc>
+          <w:tcPr>
+            <w:tcW w:w="3115" w:type="dxa"/>
+          </w:tcPr>
+          <w:p>
+            <w:pPr>
+              <w:rPr>
+                <w:rFonts w:ascii="Times New Roman" w:hAnsi="Times New Roman" w:cs="Times New Roman"/>
+                <w:sz w:val="28"/>
+                <w:szCs w:val="28"/>
+              </w:rPr>
+            </w:pPr>
+            <w:r>
+              <w:rPr>
+                <w:rFonts w:ascii="Times New Roman" w:hAnsi="Times New Roman" w:cs="Times New Roman"/>
+                <w:sz w:val="28"/>
+                <w:szCs w:val="28"/>
+              </w:rPr>
+              <w:t>Выводится текст ошибки, поле подсвечивается красным</w:t>
+            </w:r>
           </w:p>
         </w:tc>
       </w:tr>
@@ -2487,34 +2361,412 @@
                 <w:szCs w:val="28"/>
               </w:rPr>
             </w:pPr>
-          </w:p>
-        </w:tc>
-        <w:tc>
-          <w:tcPr>
-            <w:tcW w:w="3115" w:type="dxa"/>
-          </w:tcPr>
-          <w:p>
-            <w:pPr>
-              <w:rPr>
-                <w:rFonts w:ascii="Times New Roman" w:hAnsi="Times New Roman" w:cs="Times New Roman"/>
-                <w:sz w:val="28"/>
-                <w:szCs w:val="28"/>
-              </w:rPr>
-            </w:pPr>
-          </w:p>
-        </w:tc>
-        <w:tc>
-          <w:tcPr>
-            <w:tcW w:w="3115" w:type="dxa"/>
-          </w:tcPr>
-          <w:p>
-            <w:pPr>
-              <w:rPr>
-                <w:rFonts w:ascii="Times New Roman" w:hAnsi="Times New Roman" w:cs="Times New Roman"/>
-                <w:sz w:val="28"/>
-                <w:szCs w:val="28"/>
-              </w:rPr>
-            </w:pPr>
+            <w:r>
+              <w:rPr>
+                <w:rFonts w:ascii="Times New Roman" w:hAnsi="Times New Roman" w:cs="Times New Roman"/>
+                <w:sz w:val="28"/>
+                <w:szCs w:val="28"/>
+              </w:rPr>
+              <w:t xml:space="preserve">Регистрация с </w:t>
+            </w:r>
+            <w:proofErr w:type="spellStart"/>
+            <w:r>
+              <w:rPr>
+                <w:rFonts w:ascii="Times New Roman" w:hAnsi="Times New Roman" w:cs="Times New Roman"/>
+                <w:sz w:val="28"/>
+                <w:szCs w:val="28"/>
+              </w:rPr>
+              <w:t>невалидным</w:t>
+            </w:r>
+            <w:proofErr w:type="spellEnd"/>
+            <w:r>
+              <w:rPr>
+                <w:rFonts w:ascii="Times New Roman" w:hAnsi="Times New Roman" w:cs="Times New Roman"/>
+                <w:sz w:val="28"/>
+                <w:szCs w:val="28"/>
+              </w:rPr>
+              <w:t xml:space="preserve"> паролем</w:t>
+            </w:r>
+          </w:p>
+        </w:tc>
+        <w:tc>
+          <w:tcPr>
+            <w:tcW w:w="3115" w:type="dxa"/>
+          </w:tcPr>
+          <w:p>
+            <w:pPr>
+              <w:rPr>
+                <w:rFonts w:ascii="Times New Roman" w:hAnsi="Times New Roman" w:cs="Times New Roman"/>
+                <w:sz w:val="28"/>
+                <w:szCs w:val="28"/>
+              </w:rPr>
+            </w:pPr>
+            <w:r>
+              <w:rPr>
+                <w:rFonts w:ascii="Times New Roman" w:hAnsi="Times New Roman" w:cs="Times New Roman"/>
+                <w:sz w:val="28"/>
+                <w:szCs w:val="28"/>
+              </w:rPr>
+              <w:t>В</w:t>
+            </w:r>
+            <w:r>
+              <w:rPr>
+                <w:rFonts w:ascii="Times New Roman" w:hAnsi="Times New Roman" w:cs="Times New Roman"/>
+                <w:sz w:val="28"/>
+                <w:szCs w:val="28"/>
+              </w:rPr>
+              <w:t xml:space="preserve">ывод ошибки о </w:t>
+            </w:r>
+            <w:proofErr w:type="spellStart"/>
+            <w:r>
+              <w:rPr>
+                <w:rFonts w:ascii="Times New Roman" w:hAnsi="Times New Roman" w:cs="Times New Roman"/>
+                <w:sz w:val="28"/>
+                <w:szCs w:val="28"/>
+              </w:rPr>
+              <w:t>невалидном</w:t>
+            </w:r>
+            <w:proofErr w:type="spellEnd"/>
+            <w:r>
+              <w:rPr>
+                <w:rFonts w:ascii="Times New Roman" w:hAnsi="Times New Roman" w:cs="Times New Roman"/>
+                <w:sz w:val="28"/>
+                <w:szCs w:val="28"/>
+              </w:rPr>
+              <w:t xml:space="preserve"> пароле</w:t>
+            </w:r>
+          </w:p>
+        </w:tc>
+        <w:tc>
+          <w:tcPr>
+            <w:tcW w:w="3115" w:type="dxa"/>
+          </w:tcPr>
+          <w:p>
+            <w:pPr>
+              <w:rPr>
+                <w:rFonts w:ascii="Times New Roman" w:hAnsi="Times New Roman" w:cs="Times New Roman"/>
+                <w:sz w:val="28"/>
+                <w:szCs w:val="28"/>
+              </w:rPr>
+            </w:pPr>
+            <w:r>
+              <w:rPr>
+                <w:rFonts w:ascii="Times New Roman" w:hAnsi="Times New Roman" w:cs="Times New Roman"/>
+                <w:sz w:val="28"/>
+                <w:szCs w:val="28"/>
+              </w:rPr>
+              <w:t>В</w:t>
+            </w:r>
+            <w:r>
+              <w:rPr>
+                <w:rFonts w:ascii="Times New Roman" w:hAnsi="Times New Roman" w:cs="Times New Roman"/>
+                <w:sz w:val="28"/>
+                <w:szCs w:val="28"/>
+              </w:rPr>
+              <w:t xml:space="preserve">ыводится текст ошибки, поле </w:t>
+            </w:r>
+            <w:proofErr w:type="spellStart"/>
+            <w:r>
+              <w:rPr>
+                <w:rFonts w:ascii="Times New Roman" w:hAnsi="Times New Roman" w:cs="Times New Roman"/>
+                <w:sz w:val="28"/>
+                <w:szCs w:val="28"/>
+              </w:rPr>
+              <w:t>посвечивается</w:t>
+            </w:r>
+            <w:proofErr w:type="spellEnd"/>
+            <w:r>
+              <w:rPr>
+                <w:rFonts w:ascii="Times New Roman" w:hAnsi="Times New Roman" w:cs="Times New Roman"/>
+                <w:sz w:val="28"/>
+                <w:szCs w:val="28"/>
+              </w:rPr>
+              <w:t xml:space="preserve"> красным</w:t>
+            </w:r>
+          </w:p>
+        </w:tc>
+      </w:tr>
+      <w:tr>
+        <w:tc>
+          <w:tcPr>
+            <w:tcW w:w="3115" w:type="dxa"/>
+          </w:tcPr>
+          <w:p>
+            <w:pPr>
+              <w:rPr>
+                <w:rFonts w:ascii="Times New Roman" w:hAnsi="Times New Roman" w:cs="Times New Roman"/>
+                <w:sz w:val="28"/>
+                <w:szCs w:val="28"/>
+              </w:rPr>
+            </w:pPr>
+            <w:r>
+              <w:rPr>
+                <w:rFonts w:ascii="Times New Roman" w:hAnsi="Times New Roman" w:cs="Times New Roman"/>
+                <w:sz w:val="28"/>
+                <w:szCs w:val="28"/>
+              </w:rPr>
+              <w:t xml:space="preserve">Регистрация с </w:t>
+            </w:r>
+            <w:proofErr w:type="spellStart"/>
+            <w:r>
+              <w:rPr>
+                <w:rFonts w:ascii="Times New Roman" w:hAnsi="Times New Roman" w:cs="Times New Roman"/>
+                <w:sz w:val="28"/>
+                <w:szCs w:val="28"/>
+              </w:rPr>
+              <w:t>невалидной</w:t>
+            </w:r>
+            <w:proofErr w:type="spellEnd"/>
+            <w:r>
+              <w:rPr>
+                <w:rFonts w:ascii="Times New Roman" w:hAnsi="Times New Roman" w:cs="Times New Roman"/>
+                <w:sz w:val="28"/>
+                <w:szCs w:val="28"/>
+              </w:rPr>
+              <w:t xml:space="preserve"> эл. почтой</w:t>
+            </w:r>
+          </w:p>
+        </w:tc>
+        <w:tc>
+          <w:tcPr>
+            <w:tcW w:w="3115" w:type="dxa"/>
+          </w:tcPr>
+          <w:p>
+            <w:pPr>
+              <w:rPr>
+                <w:rFonts w:ascii="Times New Roman" w:hAnsi="Times New Roman" w:cs="Times New Roman"/>
+                <w:sz w:val="28"/>
+                <w:szCs w:val="28"/>
+              </w:rPr>
+            </w:pPr>
+            <w:r>
+              <w:rPr>
+                <w:rFonts w:ascii="Times New Roman" w:hAnsi="Times New Roman" w:cs="Times New Roman"/>
+                <w:sz w:val="28"/>
+                <w:szCs w:val="28"/>
+              </w:rPr>
+              <w:t xml:space="preserve">Вывод ошибки о </w:t>
+            </w:r>
+            <w:proofErr w:type="spellStart"/>
+            <w:r>
+              <w:rPr>
+                <w:rFonts w:ascii="Times New Roman" w:hAnsi="Times New Roman" w:cs="Times New Roman"/>
+                <w:sz w:val="28"/>
+                <w:szCs w:val="28"/>
+              </w:rPr>
+              <w:t>невалидном</w:t>
+            </w:r>
+            <w:proofErr w:type="spellEnd"/>
+            <w:r>
+              <w:rPr>
+                <w:rFonts w:ascii="Times New Roman" w:hAnsi="Times New Roman" w:cs="Times New Roman"/>
+                <w:sz w:val="28"/>
+                <w:szCs w:val="28"/>
+              </w:rPr>
+              <w:t xml:space="preserve"> значении</w:t>
+            </w:r>
+          </w:p>
+        </w:tc>
+        <w:tc>
+          <w:tcPr>
+            <w:tcW w:w="3115" w:type="dxa"/>
+          </w:tcPr>
+          <w:p>
+            <w:pPr>
+              <w:rPr>
+                <w:rFonts w:ascii="Times New Roman" w:hAnsi="Times New Roman" w:cs="Times New Roman"/>
+                <w:sz w:val="28"/>
+                <w:szCs w:val="28"/>
+              </w:rPr>
+            </w:pPr>
+            <w:r>
+              <w:rPr>
+                <w:rFonts w:ascii="Times New Roman" w:hAnsi="Times New Roman" w:cs="Times New Roman"/>
+                <w:sz w:val="28"/>
+                <w:szCs w:val="28"/>
+              </w:rPr>
+              <w:t xml:space="preserve">Выводится текст ошибки, поле </w:t>
+            </w:r>
+            <w:proofErr w:type="spellStart"/>
+            <w:r>
+              <w:rPr>
+                <w:rFonts w:ascii="Times New Roman" w:hAnsi="Times New Roman" w:cs="Times New Roman"/>
+                <w:sz w:val="28"/>
+                <w:szCs w:val="28"/>
+              </w:rPr>
+              <w:t>посвечивается</w:t>
+            </w:r>
+            <w:proofErr w:type="spellEnd"/>
+            <w:r>
+              <w:rPr>
+                <w:rFonts w:ascii="Times New Roman" w:hAnsi="Times New Roman" w:cs="Times New Roman"/>
+                <w:sz w:val="28"/>
+                <w:szCs w:val="28"/>
+              </w:rPr>
+              <w:t xml:space="preserve"> красным</w:t>
+            </w:r>
+          </w:p>
+        </w:tc>
+      </w:tr>
+      <w:tr>
+        <w:tc>
+          <w:tcPr>
+            <w:tcW w:w="3115" w:type="dxa"/>
+          </w:tcPr>
+          <w:p>
+            <w:pPr>
+              <w:rPr>
+                <w:rFonts w:ascii="Times New Roman" w:hAnsi="Times New Roman" w:cs="Times New Roman"/>
+                <w:sz w:val="28"/>
+                <w:szCs w:val="28"/>
+              </w:rPr>
+            </w:pPr>
+            <w:r>
+              <w:rPr>
+                <w:rFonts w:ascii="Times New Roman" w:hAnsi="Times New Roman" w:cs="Times New Roman"/>
+                <w:sz w:val="28"/>
+                <w:szCs w:val="28"/>
+              </w:rPr>
+              <w:t>Регистрация с неверным подтверждением пароля</w:t>
+            </w:r>
+          </w:p>
+        </w:tc>
+        <w:tc>
+          <w:tcPr>
+            <w:tcW w:w="3115" w:type="dxa"/>
+          </w:tcPr>
+          <w:p>
+            <w:pPr>
+              <w:rPr>
+                <w:rFonts w:ascii="Times New Roman" w:hAnsi="Times New Roman" w:cs="Times New Roman"/>
+                <w:sz w:val="28"/>
+                <w:szCs w:val="28"/>
+              </w:rPr>
+            </w:pPr>
+            <w:r>
+              <w:rPr>
+                <w:rFonts w:ascii="Times New Roman" w:hAnsi="Times New Roman" w:cs="Times New Roman"/>
+                <w:sz w:val="28"/>
+                <w:szCs w:val="28"/>
+              </w:rPr>
+              <w:t>В</w:t>
+            </w:r>
+            <w:r>
+              <w:rPr>
+                <w:rFonts w:ascii="Times New Roman" w:hAnsi="Times New Roman" w:cs="Times New Roman"/>
+                <w:sz w:val="28"/>
+                <w:szCs w:val="28"/>
+              </w:rPr>
+              <w:t>ывод ошибки о неверном подтверждении</w:t>
+            </w:r>
+          </w:p>
+        </w:tc>
+        <w:tc>
+          <w:tcPr>
+            <w:tcW w:w="3115" w:type="dxa"/>
+          </w:tcPr>
+          <w:p>
+            <w:pPr>
+              <w:rPr>
+                <w:rFonts w:ascii="Times New Roman" w:hAnsi="Times New Roman" w:cs="Times New Roman"/>
+                <w:sz w:val="28"/>
+                <w:szCs w:val="28"/>
+              </w:rPr>
+            </w:pPr>
+            <w:r>
+              <w:rPr>
+                <w:rFonts w:ascii="Times New Roman" w:hAnsi="Times New Roman" w:cs="Times New Roman"/>
+                <w:sz w:val="28"/>
+                <w:szCs w:val="28"/>
+              </w:rPr>
+              <w:t xml:space="preserve">Выводится текст ошибки, поле </w:t>
+            </w:r>
+            <w:proofErr w:type="spellStart"/>
+            <w:r>
+              <w:rPr>
+                <w:rFonts w:ascii="Times New Roman" w:hAnsi="Times New Roman" w:cs="Times New Roman"/>
+                <w:sz w:val="28"/>
+                <w:szCs w:val="28"/>
+              </w:rPr>
+              <w:t>посвечивается</w:t>
+            </w:r>
+            <w:proofErr w:type="spellEnd"/>
+            <w:r>
+              <w:rPr>
+                <w:rFonts w:ascii="Times New Roman" w:hAnsi="Times New Roman" w:cs="Times New Roman"/>
+                <w:sz w:val="28"/>
+                <w:szCs w:val="28"/>
+              </w:rPr>
+              <w:t xml:space="preserve"> красным</w:t>
+            </w:r>
+          </w:p>
+        </w:tc>
+      </w:tr>
+      <w:tr>
+        <w:tc>
+          <w:tcPr>
+            <w:tcW w:w="3115" w:type="dxa"/>
+          </w:tcPr>
+          <w:p>
+            <w:pPr>
+              <w:rPr>
+                <w:rFonts w:ascii="Times New Roman" w:hAnsi="Times New Roman" w:cs="Times New Roman"/>
+                <w:sz w:val="28"/>
+                <w:szCs w:val="28"/>
+              </w:rPr>
+            </w:pPr>
+            <w:r>
+              <w:rPr>
+                <w:rFonts w:ascii="Times New Roman" w:hAnsi="Times New Roman" w:cs="Times New Roman"/>
+                <w:sz w:val="28"/>
+                <w:szCs w:val="28"/>
+              </w:rPr>
+              <w:t>Регистрация с валидными данными</w:t>
+            </w:r>
+          </w:p>
+        </w:tc>
+        <w:tc>
+          <w:tcPr>
+            <w:tcW w:w="3115" w:type="dxa"/>
+          </w:tcPr>
+          <w:p>
+            <w:pPr>
+              <w:rPr>
+                <w:rFonts w:ascii="Times New Roman" w:hAnsi="Times New Roman" w:cs="Times New Roman"/>
+                <w:sz w:val="28"/>
+                <w:szCs w:val="28"/>
+              </w:rPr>
+            </w:pPr>
+            <w:r>
+              <w:rPr>
+                <w:rFonts w:ascii="Times New Roman" w:hAnsi="Times New Roman" w:cs="Times New Roman"/>
+                <w:sz w:val="28"/>
+                <w:szCs w:val="28"/>
+              </w:rPr>
+              <w:t>Успешная регистрация</w:t>
+            </w:r>
+          </w:p>
+        </w:tc>
+        <w:tc>
+          <w:tcPr>
+            <w:tcW w:w="3115" w:type="dxa"/>
+          </w:tcPr>
+          <w:p>
+            <w:pPr>
+              <w:rPr>
+                <w:rFonts w:ascii="Times New Roman" w:hAnsi="Times New Roman" w:cs="Times New Roman"/>
+                <w:sz w:val="28"/>
+                <w:szCs w:val="28"/>
+              </w:rPr>
+            </w:pPr>
+            <w:r>
+              <w:rPr>
+                <w:rFonts w:ascii="Times New Roman" w:hAnsi="Times New Roman" w:cs="Times New Roman"/>
+                <w:sz w:val="28"/>
+                <w:szCs w:val="28"/>
+              </w:rPr>
+              <w:t>Вывод окна сообщения об успешной регистрации</w:t>
+            </w:r>
           </w:p>
         </w:tc>
       </w:tr>
@@ -2527,6 +2779,34 @@
           <w:szCs w:val="28"/>
         </w:rPr>
       </w:pPr>
+    </w:p>
+    <w:p>
+      <w:pPr>
+        <w:rPr>
+          <w:rFonts w:ascii="Times New Roman" w:hAnsi="Times New Roman" w:cs="Times New Roman"/>
+          <w:sz w:val="28"/>
+          <w:szCs w:val="28"/>
+        </w:rPr>
+      </w:pPr>
+      <w:r>
+        <w:rPr>
+          <w:rFonts w:ascii="Times New Roman" w:hAnsi="Times New Roman" w:cs="Times New Roman"/>
+          <w:sz w:val="28"/>
+          <w:szCs w:val="28"/>
+        </w:rPr>
+        <w:t>Задание 4</w:t>
+      </w:r>
+    </w:p>
+    <w:p>
+      <w:pPr>
+        <w:rPr>
+          <w:rFonts w:ascii="Times New Roman" w:hAnsi="Times New Roman" w:cs="Times New Roman"/>
+          <w:sz w:val="28"/>
+          <w:szCs w:val="28"/>
+        </w:rPr>
+      </w:pPr>
+      <w:bookmarkStart w:id="0" w:name="_GoBack"/>
+      <w:bookmarkEnd w:id="0"/>
     </w:p>
     <w:sectPr>
       <w:pgSz w:w="11906" w:h="16838"/>

</xml_diff>